<commit_message>
Lay-reader pass, 08_industry_synthesis (TASKS 20, decision 58): plain-language opening in README, notebook builder and executed notebook markdown, and report; glossary linked; report rebuilt, notebook re-executed after the TZ run
Co-Authored-By: Claude Fable 5.1 <noreply@anthropic.com>
</commit_message>
<xml_diff>
--- a/plans/05_delta-probed-ir-pipeline/modules/08_industry_synthesis/Reflective_Synthesis_Paper.docx
+++ b/plans/05_delta-probed-ir-pipeline/modules/08_industry_synthesis/Reflective_Synthesis_Paper.docx
@@ -88,6 +88,15 @@
           <w:i w:val="0"/>
         </w:rPr>
         <w:t>The integrated artifact is a request service on top of the project's public Spectrum Atlas. A request names a molecule, a target rung on a six-rung ladder (listed, cheap level done, correction predicted, spectrum predicted, anchored, validated), a budget and free text. A request officer reads the repository's export — the only source it is allowed to read — and answers with one of three outputs. A certificate carries the spectrum, a per-band error budget expressed in the laboratory's own tolerance per family, a cost record in which every euro traces to a run log or to a measured price table, a coverage table of the coupled-cluster evidence, and a provenance block signed by release, deck hash and commit. A refusal names the gate or the cap that stopped the request and the measured price of the missing step. A run order is a proposal in the run steward's schema, and it can start nothing until the steward's deterministic gate has approved it. In this build the worker behind a run order is a replay of recorded run logs — the user's decision of 28 September — so the service spends no money and touches no machine while the licence question is still open.</w:t>
+      </w:r>
+    </w:p>
+    <w:p>
+      <w:r>
+        <w:rPr>
+          <w:b w:val="0"/>
+          <w:i w:val="0"/>
+        </w:rPr>
+        <w:t>For a reader without chemistry: The integrated system turns a request — a molecule, how accurate the answer must be, a budget — into either a computed infrared spectrum with a stated accuracy and price, or a refusal that names the missing step. Its parts come from the earlier modules: the library of existing predictions (02), the laboratory numbers to score against (03), the trained correction (05) and the run steward that is allowed to start work (07). Terms are defined in ../../GLOSSARY.md.</w:t>
       </w:r>
     </w:p>
     <w:p>

</xml_diff>

<commit_message>
Module 08 review (overnight): author in the notebook and README, glossary URL, the unused 'write' import gone (builder and stored notebook patched in place), README test counts (11 green today); paper rebuilt for the glossary link. The paper's content under decision 63 is a writing-phase task (REVIEW_2026-10-17.md)
Co-Authored-By: Claude Opus 5.5 <noreply@anthropic.com>
</commit_message>
<xml_diff>
--- a/plans/05_delta-probed-ir-pipeline/modules/08_industry_synthesis/Reflective_Synthesis_Paper.docx
+++ b/plans/05_delta-probed-ir-pipeline/modules/08_industry_synthesis/Reflective_Synthesis_Paper.docx
@@ -35,7 +35,7 @@
           <w:b w:val="0"/>
           <w:i w:val="0"/>
         </w:rPr>
-        <w:t>Frederic Petrignani · 2026-09-28</w:t>
+        <w:t>Frederic Petrignani · 2026-10-10</w:t>
       </w:r>
     </w:p>
     <w:p/>
@@ -96,16 +96,16 @@
           <w:b w:val="0"/>
           <w:i w:val="0"/>
         </w:rPr>
-        <w:t>For a reader without chemistry: The integrated system turns a request — a molecule, how accurate the answer must be, a budget — into either a computed infrared spectrum with a stated accuracy and price, or a refusal that names the missing step. Its parts come from the earlier modules: the library of existing predictions (02), the laboratory numbers to score against (03), the trained correction (05) and the run steward that is allowed to start work (07). Terms are defined in ../../GLOSSARY.md.</w:t>
-      </w:r>
-    </w:p>
-    <w:p>
-      <w:r>
-        <w:rPr>
-          <w:b w:val="0"/>
-          <w:i w:val="0"/>
-        </w:rPr>
-        <w:t>Run on the repository as it stands, the catalogue holds 11,321 molecules: 532 at the cheap rung, 1 anchored and 1 validated; the predicted rungs are empty by rule. The eight pre-registered scenarios all produced the registered kind of output (8 of 8); every cost line traced to its source; and the failure case — a family whose coupled-cluster composite deviates from CCSD(T) by more than the laboratory tolerance — is displayed on the benzene certificate rather than hidden.</w:t>
+        <w:t>For a reader without chemistry: The integrated system turns a request — a molecule, how accurate the answer must be, a budget — into either a computed infrared spectrum with a stated accuracy and price, or a refusal that names the missing step. Its parts come from the earlier modules: the library of existing predictions (02), the laboratory numbers to score against (03), the trained correction (05) and the run steward that is allowed to start work (07). Terms are defined in the glossary (https://github.com/thebreadishard/udacity-capstone-plan/blob/master/plans/05_delta-probed-ir-pipeline/modules/GLOSSARY.md).</w:t>
+      </w:r>
+    </w:p>
+    <w:p>
+      <w:r>
+        <w:rPr>
+          <w:b w:val="0"/>
+          <w:i w:val="0"/>
+        </w:rPr>
+        <w:t>Run on the repository as it stands, the catalogue holds 13,714 molecules: 1040 at the cheap rung, 5 anchored and 1 validated; the predicted rungs are empty by rule. The eight pre-registered scenarios all produced the registered kind of output (8 of 8); every cost line traced to its source; and the failure case — a family whose coupled-cluster composite deviates from CCSD(T) by more than the laboratory tolerance — is displayed on the benzene certificate rather than hidden.</w:t>
       </w:r>
     </w:p>
     <w:p>

</xml_diff>